<commit_message>
v122 Article XIX review: MA Director now elected (not Candidate Register), §19.8.a submitted-record model, §19.8.b interim functions updated, Phase 3 table adds MA Director election, §19.7.e Commission→panel, §19.9 redundant label removed
</commit_message>
<xml_diff>
--- a/constitution-v122.docx
+++ b/constitution-v122.docx
@@ -14241,7 +14241,7 @@
         <w:spacing w:after="60" w:before="60"/>
       </w:pPr>
       <w:r>
-        <w:t xml:space="preserve">19.3.c Phase 2 — Institutional Construction (Days 91–270): Statehood Audits are conducted for all entering territories. The Candidate Registers for the Monetary Authority Director and RSA Director are assembled under §19.8. The National Voting System is fully deployed for citizen registration. Phase 2 ends at Day 270.</w:t>
+        <w:t>19.3.c Phase 2 — Institutional Construction (Days 91–270): Statehood Audits are conducted for all entering territories. The Candidate Register for the RSA Director and for Monetary Authority board members is assembled under §19.8. The first MA Director election is scheduled for Phase 3 as a national election alongside other federal offices. The National Voting System is fully deployed for citizen registration. Phase 2 ends at Day 270.</w:t>
       </w:r>
     </w:p>
     <w:p>
@@ -14773,7 +14773,7 @@
                 <w:sz w:val="20"/>
                 <w:szCs w:val="20"/>
               </w:rPr>
-              <w:t xml:space="preserve">First National Election Day: all 9 SCOTUS seats, all Senate seats, all House seats, all Electoral Commission seats, and the Presidency elected simultaneously. House seats PM within 45 days. President takes office at Phase 4 activation.</w:t>
+              <w:t>First National Election Day: all 9 Supreme Court seats, all Senate seats, all House seats, all Electoral Commission seats, the Presidency, and the Monetary Authority Director elected simultaneously. House seats PM within 45 days. President and MA Director take office at Phase 4 activation.</w:t>
             </w:r>
           </w:p>
         </w:tc>
@@ -15326,7 +15326,7 @@
           <w:sz w:val="22"/>
           <w:szCs w:val="22"/>
         </w:rPr>
-        <w:t xml:space="preserve">The joint Inspectorate panel is the receiving body for all Transition-Period territorial elections and subdivision elections under this section. It verifies that submitted resolutions meet the constitutional requirements, coordinates Statehood Audit scheduling with the Legislative Inspectorate, and maintains the official registry of each state's transition status — State, Territory-by-election, Territory-by-audit, or Subdivision-in-progress — on the National Record System throughout the Transition Window. The Commission publishes a complete transition status map updated monthly during Phase 2.</w:t>
+        <w:t>The joint Inspectorate panel is the receiving body for all Transition-Period territorial elections and subdivision elections under this section. It verifies that submitted resolutions meet the constitutional requirements, coordinates Statehood Audit scheduling with the Legislative Inspectorate, and maintains the official registry of each state's transition status — State, Territory-by-election, Territory-by-audit, or Subdivision-in-progress — on the National Record System throughout the Transition Window. The panel publishes a complete transition status map updated monthly during Phase 2.</w:t>
       </w:r>
     </w:p>
     <w:p>
@@ -15377,7 +15377,7 @@
           <w:sz w:val="22"/>
           <w:szCs w:val="22"/>
         </w:rPr>
-        <w:t>During Phase 2, the joint Inspectorate panel assembles an initial Candidate Register for the Monetary Authority Director and the Record System Authority Director. the Legislature may by statute designate additional constitutionally independent bodies requiring a Candidate Register, to which the provisions of this section apply. For each candidate, the panel publishes a factual assessment of professional background and relevant expertise to the National Record System, applying the same standards the Executive Inspectorate applies to subsequent reviews. The panel may draw on candidates with experience in prior government fiscal or technical institutions where those institutions were not assessed as having participated in the conduct requiring reform; on international expertise from recognized fiscal, monetary, or technical bodies where domestic expertise is unavailable or compromised; and on citizens residing abroad whose expertise is domestic expertise for this purpose. The panel must publish its assessment of available expertise sources to the National Record System before constituting any Register.</w:t>
+        <w:t>During Phase 2, the joint Inspectorate panel assembles an initial Candidate Register for the Monetary Authority board members and the Record System Authority Director. No Candidate Register is required for the Monetary Authority Director, who is elected by national Ranked Choice Voting under §10.4.a. the Legislature may by statute designate additional constitutionally independent bodies requiring a Candidate Register, to which the provisions of this section apply. For each candidate, the panel receives a candidate disclosure record submitted by or on behalf of the candidate — including professional background, relevant expertise, financial disclosures, and any prior government positions held. The panel reviews the submitted record for factual accuracy, applies the constitutional eligibility criteria, and publishes the record together with its recommendation to the National Record System, applying the same standards the Executive Inspectorate applies to subsequent reviews. The panel may draw on candidates with experience in prior government fiscal or technical institutions where those institutions were not assessed as having participated in the conduct requiring reform; on international expertise from recognized fiscal, monetary, or technical bodies where domestic expertise is unavailable or compromised; and on citizens residing abroad whose expertise is domestic expertise for this purpose. The panel must publish its assessment of available expertise sources to the National Record System before constituting any Register.</w:t>
       </w:r>
     </w:p>
     <w:p>
@@ -15405,7 +15405,6 @@
           <w:sz w:val="22"/>
           <w:szCs w:val="22"/>
         </w:rPr>
-        <w:t xml:space="preserve">19.9 Transitional Accountability Mechanism: </w:t>
       </w:r>
       <w:r>
         <w:rPr>
@@ -15727,7 +15726,7 @@
           <w:sz w:val="22"/>
           <w:szCs w:val="22"/>
         </w:rPr>
-        <w:t xml:space="preserve">The joint Inspectorate panel performs interim MA fiscal certification functions from Phase 4 activation until the first MA Director is confirmed, including the initial gross national revenue certification and the inherited debt assessment required under §19.6.a. These interim certifications carry full constitutional weight. The first Prime Minister must nominate an MA Director within 90 days of Phase 4 activation and an RSA Director within 180 days of Phase 4 activation.</w:t>
+        <w:t>The joint Inspectorate panel performs interim MA fiscal certification functions from Phase 4 activation until the first MA Director takes office following the Phase 3 election, including the initial gross national revenue certification and the inherited debt assessment required under §19.6.a. These interim certifications carry full constitutional weight. The first MA Director election is held as part of the Phase 3 National Election Day. The first Prime Minister must nominate MA board members within 90 days of Phase 4 activation and must nominate an RSA Director within 180 days of Phase 4 activation.</w:t>
       </w:r>
     </w:p>
     <w:p>

</xml_diff>